<commit_message>
nmv 10 10 2026
</commit_message>
<xml_diff>
--- a/TS-Kramam/TS-5.3/TS 5.3 Malayalam Krama Paatam Corrections.docx
+++ b/TS-Kramam/TS-5.3/TS 5.3 Malayalam Krama Paatam Corrections.docx
@@ -3550,7 +3550,7 @@
                 <w:color w:val="EE0000"/>
                 <w:sz w:val="28"/>
                 <w:szCs w:val="36"/>
-                <w:lang w:val="it-IT"/>
+                <w:lang w:val="en-IN"/>
               </w:rPr>
             </w:pPr>
             <w:r>
@@ -3560,7 +3560,7 @@
                 <w:color w:val="EE0000"/>
                 <w:sz w:val="28"/>
                 <w:szCs w:val="36"/>
-                <w:lang w:val="it-IT"/>
+                <w:lang w:val="en-IN"/>
               </w:rPr>
               <w:t>Krama Vaakyam No.– 42</w:t>
             </w:r>
@@ -3786,6 +3786,540 @@
                 <w:lang w:val="it-IT" w:eastAsia="en-IN" w:bidi="ml-IN"/>
               </w:rPr>
               <w:t>xZy—rôZJ | ¥RõxZy—rôZJ K¡k¡¥Z |</w:t>
+            </w:r>
+          </w:p>
+        </w:tc>
+      </w:tr>
+      <w:tr>
+        <w:trPr>
+          <w:trHeight w:val="1124"/>
+        </w:trPr>
+        <w:tc>
+          <w:tcPr>
+            <w:tcW w:w="3764" w:type="dxa"/>
+          </w:tcPr>
+          <w:p>
+            <w:pPr>
+              <w:widowControl w:val="0"/>
+              <w:tabs>
+                <w:tab w:val="left" w:pos="993"/>
+              </w:tabs>
+              <w:autoSpaceDE w:val="0"/>
+              <w:autoSpaceDN w:val="0"/>
+              <w:adjustRightInd w:val="0"/>
+              <w:spacing w:before="0" w:line="240" w:lineRule="auto"/>
+              <w:ind w:right="297"/>
+              <w:rPr>
+                <w:rFonts w:cs="Arial"/>
+                <w:b/>
+                <w:color w:val="EE0000"/>
+                <w:sz w:val="28"/>
+                <w:szCs w:val="32"/>
+              </w:rPr>
+            </w:pPr>
+            <w:r>
+              <w:rPr>
+                <w:rFonts w:cs="Arial"/>
+                <w:b/>
+                <w:color w:val="EE0000"/>
+                <w:sz w:val="28"/>
+                <w:szCs w:val="32"/>
+              </w:rPr>
+              <w:t>T.S.5.3.</w:t>
+            </w:r>
+            <w:r>
+              <w:rPr>
+                <w:rFonts w:cs="Arial"/>
+                <w:b/>
+                <w:color w:val="EE0000"/>
+                <w:sz w:val="28"/>
+                <w:szCs w:val="32"/>
+              </w:rPr>
+              <w:t>12</w:t>
+            </w:r>
+            <w:r>
+              <w:rPr>
+                <w:rFonts w:cs="Arial"/>
+                <w:b/>
+                <w:color w:val="EE0000"/>
+                <w:sz w:val="28"/>
+                <w:szCs w:val="32"/>
+              </w:rPr>
+              <w:t>.2 – Kramam</w:t>
+            </w:r>
+          </w:p>
+          <w:p>
+            <w:pPr>
+              <w:widowControl w:val="0"/>
+              <w:tabs>
+                <w:tab w:val="left" w:pos="993"/>
+              </w:tabs>
+              <w:autoSpaceDE w:val="0"/>
+              <w:autoSpaceDN w:val="0"/>
+              <w:adjustRightInd w:val="0"/>
+              <w:spacing w:before="0" w:line="240" w:lineRule="auto"/>
+              <w:ind w:right="297"/>
+              <w:rPr>
+                <w:rFonts w:cs="Arial"/>
+                <w:b/>
+                <w:color w:val="EE0000"/>
+                <w:sz w:val="28"/>
+                <w:szCs w:val="36"/>
+                <w:lang w:val="en-IN"/>
+              </w:rPr>
+            </w:pPr>
+            <w:r>
+              <w:rPr>
+                <w:rFonts w:cs="Arial"/>
+                <w:b/>
+                <w:color w:val="EE0000"/>
+                <w:sz w:val="28"/>
+                <w:szCs w:val="36"/>
+                <w:lang w:val="en-IN"/>
+              </w:rPr>
+              <w:t xml:space="preserve">Krama Vaakyam No.– </w:t>
+            </w:r>
+            <w:r>
+              <w:rPr>
+                <w:rFonts w:cs="Arial"/>
+                <w:b/>
+                <w:color w:val="EE0000"/>
+                <w:sz w:val="28"/>
+                <w:szCs w:val="36"/>
+                <w:lang w:val="en-IN"/>
+              </w:rPr>
+              <w:t>7</w:t>
+            </w:r>
+            <w:r>
+              <w:rPr>
+                <w:rFonts w:cs="Arial"/>
+                <w:b/>
+                <w:color w:val="EE0000"/>
+                <w:sz w:val="28"/>
+                <w:szCs w:val="36"/>
+                <w:lang w:val="en-IN"/>
+              </w:rPr>
+              <w:t>2</w:t>
+            </w:r>
+          </w:p>
+          <w:p>
+            <w:pPr>
+              <w:widowControl w:val="0"/>
+              <w:tabs>
+                <w:tab w:val="left" w:pos="993"/>
+              </w:tabs>
+              <w:autoSpaceDE w:val="0"/>
+              <w:autoSpaceDN w:val="0"/>
+              <w:adjustRightInd w:val="0"/>
+              <w:spacing w:before="0" w:line="240" w:lineRule="auto"/>
+              <w:ind w:right="297"/>
+              <w:rPr>
+                <w:rFonts w:cs="Arial"/>
+                <w:b/>
+                <w:color w:val="EE0000"/>
+                <w:sz w:val="28"/>
+                <w:szCs w:val="32"/>
+              </w:rPr>
+            </w:pPr>
+            <w:r>
+              <w:rPr>
+                <w:rFonts w:cs="Arial"/>
+                <w:b/>
+                <w:color w:val="EE0000"/>
+                <w:sz w:val="28"/>
+                <w:szCs w:val="32"/>
+                <w:lang w:val="it-IT"/>
+              </w:rPr>
+              <w:t>Panchaati No</w:t>
+            </w:r>
+            <w:r>
+              <w:rPr>
+                <w:rFonts w:cs="Arial"/>
+                <w:b/>
+                <w:color w:val="EE0000"/>
+                <w:szCs w:val="32"/>
+                <w:lang w:val="it-IT"/>
+              </w:rPr>
+              <w:t xml:space="preserve">. - </w:t>
+            </w:r>
+            <w:r>
+              <w:rPr>
+                <w:rFonts w:cs="Arial"/>
+                <w:b/>
+                <w:color w:val="EE0000"/>
+                <w:sz w:val="28"/>
+                <w:szCs w:val="32"/>
+                <w:lang w:val="it-IT"/>
+              </w:rPr>
+              <w:t>48</w:t>
+            </w:r>
+          </w:p>
+        </w:tc>
+        <w:tc>
+          <w:tcPr>
+            <w:tcW w:w="5528" w:type="dxa"/>
+          </w:tcPr>
+          <w:p>
+            <w:pPr>
+              <w:widowControl w:val="0"/>
+              <w:autoSpaceDE w:val="0"/>
+              <w:autoSpaceDN w:val="0"/>
+              <w:adjustRightInd w:val="0"/>
+              <w:spacing w:line="252" w:lineRule="auto"/>
+              <w:rPr>
+                <w:rFonts w:ascii="BRH Malayalam Extra" w:eastAsia="Times New Roman" w:hAnsi="BRH Malayalam Extra" w:cs="BRH Malayalam Extra"/>
+                <w:color w:val="EE0000"/>
+                <w:sz w:val="40"/>
+                <w:szCs w:val="40"/>
+                <w:lang w:eastAsia="en-IN" w:bidi="ml-IN"/>
+              </w:rPr>
+            </w:pPr>
+            <w:r>
+              <w:rPr>
+                <w:rFonts w:ascii="BRH Malayalam Extra" w:eastAsia="Times New Roman" w:hAnsi="BRH Malayalam Extra" w:cs="BRH Malayalam Extra"/>
+                <w:color w:val="EE0000"/>
+                <w:sz w:val="40"/>
+                <w:szCs w:val="40"/>
+                <w:lang w:eastAsia="en-IN" w:bidi="ml-IN"/>
+              </w:rPr>
+              <w:t>Aqû—sõ sªp</w:t>
+            </w:r>
+            <w:r>
+              <w:rPr>
+                <w:rFonts w:ascii="BRH Malayalam Extra" w:eastAsia="Times New Roman" w:hAnsi="BRH Malayalam Extra" w:cs="BRH Malayalam Extra"/>
+                <w:color w:val="EE0000"/>
+                <w:sz w:val="32"/>
+                <w:szCs w:val="40"/>
+                <w:lang w:eastAsia="en-IN" w:bidi="ml-IN"/>
+              </w:rPr>
+              <w:t>–</w:t>
+            </w:r>
+            <w:r>
+              <w:rPr>
+                <w:rFonts w:ascii="BRH Malayalam Extra" w:eastAsia="Times New Roman" w:hAnsi="BRH Malayalam Extra" w:cs="BRH Malayalam Extra"/>
+                <w:color w:val="EE0000"/>
+                <w:sz w:val="40"/>
+                <w:szCs w:val="40"/>
+                <w:lang w:eastAsia="en-IN" w:bidi="ml-IN"/>
+              </w:rPr>
+              <w:t xml:space="preserve">Zûxj— | </w:t>
+            </w:r>
+          </w:p>
+          <w:p>
+            <w:pPr>
+              <w:widowControl w:val="0"/>
+              <w:autoSpaceDE w:val="0"/>
+              <w:autoSpaceDN w:val="0"/>
+              <w:adjustRightInd w:val="0"/>
+              <w:spacing w:before="0" w:line="240" w:lineRule="auto"/>
+              <w:rPr>
+                <w:rFonts w:ascii="BRH Malayalam Extra" w:eastAsia="Times New Roman" w:hAnsi="BRH Malayalam Extra" w:cs="BRH Malayalam Extra"/>
+                <w:color w:val="EE0000"/>
+                <w:sz w:val="40"/>
+                <w:szCs w:val="40"/>
+                <w:lang w:val="en-IN" w:eastAsia="en-IN" w:bidi="ml-IN"/>
+              </w:rPr>
+            </w:pPr>
+            <w:r>
+              <w:rPr>
+                <w:rFonts w:ascii="BRH Malayalam Extra" w:eastAsia="Times New Roman" w:hAnsi="BRH Malayalam Extra" w:cs="BRH Malayalam Extra"/>
+                <w:color w:val="EE0000"/>
+                <w:sz w:val="40"/>
+                <w:szCs w:val="40"/>
+                <w:lang w:val="en-IN" w:eastAsia="en-IN" w:bidi="ml-IN"/>
+              </w:rPr>
+              <w:t>s</w:t>
+            </w:r>
+            <w:r>
+              <w:rPr>
+                <w:rFonts w:ascii="BRH Malayalam Extra" w:eastAsia="Times New Roman" w:hAnsi="BRH Malayalam Extra" w:cs="BRH Malayalam Extra"/>
+                <w:color w:val="EE0000"/>
+                <w:sz w:val="32"/>
+                <w:szCs w:val="40"/>
+                <w:lang w:val="en-IN" w:eastAsia="en-IN" w:bidi="ml-IN"/>
+              </w:rPr>
+              <w:t>–</w:t>
+            </w:r>
+            <w:r>
+              <w:rPr>
+                <w:rFonts w:ascii="BRH Malayalam Extra" w:eastAsia="Times New Roman" w:hAnsi="BRH Malayalam Extra" w:cs="BRH Malayalam Extra"/>
+                <w:color w:val="EE0000"/>
+                <w:sz w:val="40"/>
+                <w:szCs w:val="40"/>
+                <w:lang w:val="en-IN" w:eastAsia="en-IN" w:bidi="ml-IN"/>
+              </w:rPr>
+              <w:t>ªp</w:t>
+            </w:r>
+            <w:r>
+              <w:rPr>
+                <w:rFonts w:ascii="BRH Malayalam Extra" w:eastAsia="Times New Roman" w:hAnsi="BRH Malayalam Extra" w:cs="BRH Malayalam Extra"/>
+                <w:color w:val="EE0000"/>
+                <w:sz w:val="40"/>
+                <w:szCs w:val="40"/>
+                <w:highlight w:val="yellow"/>
+                <w:lang w:val="en-IN" w:eastAsia="en-IN" w:bidi="ml-IN"/>
+              </w:rPr>
+              <w:t>x</w:t>
+            </w:r>
+            <w:r>
+              <w:rPr>
+                <w:rFonts w:ascii="BRH Malayalam Extra" w:eastAsia="Times New Roman" w:hAnsi="BRH Malayalam Extra" w:cs="BRH Malayalam Extra"/>
+                <w:color w:val="EE0000"/>
+                <w:sz w:val="32"/>
+                <w:szCs w:val="40"/>
+                <w:lang w:val="en-IN" w:eastAsia="en-IN" w:bidi="ml-IN"/>
+              </w:rPr>
+              <w:t>–</w:t>
+            </w:r>
+            <w:r>
+              <w:rPr>
+                <w:rFonts w:ascii="BRH Malayalam Extra" w:eastAsia="Times New Roman" w:hAnsi="BRH Malayalam Extra" w:cs="BRH Malayalam Extra"/>
+                <w:color w:val="EE0000"/>
+                <w:sz w:val="40"/>
+                <w:szCs w:val="40"/>
+                <w:lang w:val="en-IN" w:eastAsia="en-IN" w:bidi="ml-IN"/>
+              </w:rPr>
+              <w:t xml:space="preserve">Zûx¥jZy— </w:t>
+            </w:r>
+          </w:p>
+          <w:p>
+            <w:pPr>
+              <w:widowControl w:val="0"/>
+              <w:autoSpaceDE w:val="0"/>
+              <w:autoSpaceDN w:val="0"/>
+              <w:adjustRightInd w:val="0"/>
+              <w:spacing w:before="0" w:line="240" w:lineRule="auto"/>
+              <w:rPr>
+                <w:rFonts w:ascii="BRH Malayalam Extra" w:eastAsia="Times New Roman" w:hAnsi="BRH Malayalam Extra" w:cs="BRH Malayalam Extra"/>
+                <w:color w:val="EE0000"/>
+                <w:sz w:val="40"/>
+                <w:szCs w:val="40"/>
+                <w:lang w:eastAsia="en-IN" w:bidi="ml-IN"/>
+              </w:rPr>
+            </w:pPr>
+            <w:r>
+              <w:rPr>
+                <w:rFonts w:ascii="BRH Malayalam Extra" w:eastAsia="Times New Roman" w:hAnsi="BRH Malayalam Extra" w:cs="BRH Malayalam Extra"/>
+                <w:color w:val="EE0000"/>
+                <w:sz w:val="40"/>
+                <w:szCs w:val="40"/>
+                <w:lang w:val="en-IN" w:eastAsia="en-IN" w:bidi="ml-IN"/>
+              </w:rPr>
+              <w:t>sªp</w:t>
+            </w:r>
+            <w:r>
+              <w:rPr>
+                <w:rFonts w:ascii="BRH Malayalam Extra" w:eastAsia="Times New Roman" w:hAnsi="BRH Malayalam Extra" w:cs="BRH Malayalam Extra"/>
+                <w:color w:val="EE0000"/>
+                <w:sz w:val="40"/>
+                <w:szCs w:val="40"/>
+                <w:lang w:val="en-IN" w:eastAsia="en-IN" w:bidi="ml-IN"/>
+              </w:rPr>
+              <w:t xml:space="preserve"> </w:t>
+            </w:r>
+            <w:r>
+              <w:rPr>
+                <w:rFonts w:ascii="BRH Malayalam Extra" w:eastAsia="Times New Roman" w:hAnsi="BRH Malayalam Extra" w:cs="BRH Malayalam Extra"/>
+                <w:color w:val="EE0000"/>
+                <w:sz w:val="40"/>
+                <w:szCs w:val="40"/>
+                <w:lang w:val="en-IN" w:eastAsia="en-IN" w:bidi="ml-IN"/>
+              </w:rPr>
+              <w:t>-</w:t>
+            </w:r>
+            <w:r>
+              <w:rPr>
+                <w:rFonts w:ascii="BRH Malayalam Extra" w:eastAsia="Times New Roman" w:hAnsi="BRH Malayalam Extra" w:cs="BRH Malayalam Extra"/>
+                <w:color w:val="EE0000"/>
+                <w:sz w:val="40"/>
+                <w:szCs w:val="40"/>
+                <w:lang w:val="en-IN" w:eastAsia="en-IN" w:bidi="ml-IN"/>
+              </w:rPr>
+              <w:t xml:space="preserve"> </w:t>
+            </w:r>
+            <w:r>
+              <w:rPr>
+                <w:rFonts w:ascii="BRH Malayalam Extra" w:eastAsia="Times New Roman" w:hAnsi="BRH Malayalam Extra" w:cs="BRH Malayalam Extra"/>
+                <w:color w:val="EE0000"/>
+                <w:sz w:val="40"/>
+                <w:szCs w:val="40"/>
+                <w:lang w:val="en-IN" w:eastAsia="en-IN" w:bidi="ml-IN"/>
+              </w:rPr>
+              <w:t>Zûxj— ||</w:t>
+            </w:r>
+          </w:p>
+        </w:tc>
+        <w:tc>
+          <w:tcPr>
+            <w:tcW w:w="5103" w:type="dxa"/>
+          </w:tcPr>
+          <w:p>
+            <w:pPr>
+              <w:widowControl w:val="0"/>
+              <w:autoSpaceDE w:val="0"/>
+              <w:autoSpaceDN w:val="0"/>
+              <w:adjustRightInd w:val="0"/>
+              <w:spacing w:line="252" w:lineRule="auto"/>
+              <w:rPr>
+                <w:rFonts w:ascii="BRH Malayalam Extra" w:eastAsia="Times New Roman" w:hAnsi="BRH Malayalam Extra" w:cs="BRH Malayalam Extra"/>
+                <w:color w:val="EE0000"/>
+                <w:sz w:val="40"/>
+                <w:szCs w:val="40"/>
+                <w:lang w:val="en-IN" w:eastAsia="en-IN" w:bidi="ml-IN"/>
+              </w:rPr>
+            </w:pPr>
+            <w:r>
+              <w:rPr>
+                <w:rFonts w:ascii="BRH Malayalam Extra" w:eastAsia="Times New Roman" w:hAnsi="BRH Malayalam Extra" w:cs="BRH Malayalam Extra"/>
+                <w:color w:val="EE0000"/>
+                <w:sz w:val="40"/>
+                <w:szCs w:val="40"/>
+                <w:lang w:val="en-IN" w:eastAsia="en-IN" w:bidi="ml-IN"/>
+              </w:rPr>
+              <w:t>Aqû—sõ sªp</w:t>
+            </w:r>
+            <w:r>
+              <w:rPr>
+                <w:rFonts w:ascii="BRH Malayalam Extra" w:eastAsia="Times New Roman" w:hAnsi="BRH Malayalam Extra" w:cs="BRH Malayalam Extra"/>
+                <w:color w:val="EE0000"/>
+                <w:sz w:val="32"/>
+                <w:szCs w:val="40"/>
+                <w:lang w:val="en-IN" w:eastAsia="en-IN" w:bidi="ml-IN"/>
+              </w:rPr>
+              <w:t>–</w:t>
+            </w:r>
+            <w:r>
+              <w:rPr>
+                <w:rFonts w:ascii="BRH Malayalam Extra" w:eastAsia="Times New Roman" w:hAnsi="BRH Malayalam Extra" w:cs="BRH Malayalam Extra"/>
+                <w:color w:val="EE0000"/>
+                <w:sz w:val="40"/>
+                <w:szCs w:val="40"/>
+                <w:lang w:val="en-IN" w:eastAsia="en-IN" w:bidi="ml-IN"/>
+              </w:rPr>
+              <w:t xml:space="preserve">Zûxj— | </w:t>
+            </w:r>
+          </w:p>
+          <w:p>
+            <w:pPr>
+              <w:widowControl w:val="0"/>
+              <w:autoSpaceDE w:val="0"/>
+              <w:autoSpaceDN w:val="0"/>
+              <w:adjustRightInd w:val="0"/>
+              <w:spacing w:before="0" w:line="240" w:lineRule="auto"/>
+              <w:rPr>
+                <w:rFonts w:ascii="BRH Malayalam Extra" w:eastAsia="Times New Roman" w:hAnsi="BRH Malayalam Extra" w:cs="BRH Malayalam Extra"/>
+                <w:color w:val="EE0000"/>
+                <w:sz w:val="40"/>
+                <w:szCs w:val="40"/>
+                <w:lang w:val="en-IN" w:eastAsia="en-IN" w:bidi="ml-IN"/>
+              </w:rPr>
+            </w:pPr>
+            <w:r>
+              <w:rPr>
+                <w:rFonts w:ascii="BRH Malayalam Extra" w:eastAsia="Times New Roman" w:hAnsi="BRH Malayalam Extra" w:cs="BRH Malayalam Extra"/>
+                <w:color w:val="EE0000"/>
+                <w:sz w:val="40"/>
+                <w:szCs w:val="40"/>
+                <w:lang w:val="en-IN" w:eastAsia="en-IN" w:bidi="ml-IN"/>
+              </w:rPr>
+              <w:t>s</w:t>
+            </w:r>
+            <w:r>
+              <w:rPr>
+                <w:rFonts w:ascii="BRH Malayalam Extra" w:eastAsia="Times New Roman" w:hAnsi="BRH Malayalam Extra" w:cs="BRH Malayalam Extra"/>
+                <w:color w:val="EE0000"/>
+                <w:sz w:val="32"/>
+                <w:szCs w:val="40"/>
+                <w:lang w:val="en-IN" w:eastAsia="en-IN" w:bidi="ml-IN"/>
+              </w:rPr>
+              <w:t>–</w:t>
+            </w:r>
+            <w:r>
+              <w:rPr>
+                <w:rFonts w:ascii="BRH Malayalam Extra" w:eastAsia="Times New Roman" w:hAnsi="BRH Malayalam Extra" w:cs="BRH Malayalam Extra"/>
+                <w:color w:val="EE0000"/>
+                <w:sz w:val="40"/>
+                <w:szCs w:val="40"/>
+                <w:lang w:val="en-IN" w:eastAsia="en-IN" w:bidi="ml-IN"/>
+              </w:rPr>
+              <w:t>ª</w:t>
+            </w:r>
+            <w:r>
+              <w:rPr>
+                <w:rFonts w:ascii="BRH Malayalam Extra" w:eastAsia="Times New Roman" w:hAnsi="BRH Malayalam Extra" w:cs="BRH Malayalam Extra"/>
+                <w:color w:val="EE0000"/>
+                <w:sz w:val="40"/>
+                <w:szCs w:val="40"/>
+                <w:highlight w:val="green"/>
+                <w:lang w:val="en-IN" w:eastAsia="en-IN" w:bidi="ml-IN"/>
+              </w:rPr>
+              <w:t>p</w:t>
+            </w:r>
+            <w:r>
+              <w:rPr>
+                <w:rFonts w:ascii="BRH Malayalam Extra" w:eastAsia="Times New Roman" w:hAnsi="BRH Malayalam Extra" w:cs="BRH Malayalam Extra"/>
+                <w:color w:val="EE0000"/>
+                <w:sz w:val="32"/>
+                <w:szCs w:val="40"/>
+                <w:lang w:val="en-IN" w:eastAsia="en-IN" w:bidi="ml-IN"/>
+              </w:rPr>
+              <w:t>–</w:t>
+            </w:r>
+            <w:r>
+              <w:rPr>
+                <w:rFonts w:ascii="BRH Malayalam Extra" w:eastAsia="Times New Roman" w:hAnsi="BRH Malayalam Extra" w:cs="BRH Malayalam Extra"/>
+                <w:color w:val="EE0000"/>
+                <w:sz w:val="40"/>
+                <w:szCs w:val="40"/>
+                <w:lang w:val="en-IN" w:eastAsia="en-IN" w:bidi="ml-IN"/>
+              </w:rPr>
+              <w:t xml:space="preserve">Zûx¥jZy— </w:t>
+            </w:r>
+          </w:p>
+          <w:p>
+            <w:pPr>
+              <w:widowControl w:val="0"/>
+              <w:autoSpaceDE w:val="0"/>
+              <w:autoSpaceDN w:val="0"/>
+              <w:adjustRightInd w:val="0"/>
+              <w:spacing w:before="0" w:line="240" w:lineRule="auto"/>
+              <w:rPr>
+                <w:rFonts w:ascii="BRH Malayalam Extra" w:eastAsia="Times New Roman" w:hAnsi="BRH Malayalam Extra" w:cs="BRH Malayalam Extra"/>
+                <w:color w:val="EE0000"/>
+                <w:sz w:val="40"/>
+                <w:szCs w:val="40"/>
+                <w:lang w:eastAsia="en-IN" w:bidi="ml-IN"/>
+              </w:rPr>
+            </w:pPr>
+            <w:r>
+              <w:rPr>
+                <w:rFonts w:ascii="BRH Malayalam Extra" w:eastAsia="Times New Roman" w:hAnsi="BRH Malayalam Extra" w:cs="BRH Malayalam Extra"/>
+                <w:color w:val="EE0000"/>
+                <w:sz w:val="40"/>
+                <w:szCs w:val="40"/>
+                <w:lang w:val="en-IN" w:eastAsia="en-IN" w:bidi="ml-IN"/>
+              </w:rPr>
+              <w:t>sªp</w:t>
+            </w:r>
+            <w:r>
+              <w:rPr>
+                <w:rFonts w:ascii="BRH Malayalam Extra" w:eastAsia="Times New Roman" w:hAnsi="BRH Malayalam Extra" w:cs="BRH Malayalam Extra"/>
+                <w:color w:val="EE0000"/>
+                <w:sz w:val="40"/>
+                <w:szCs w:val="40"/>
+                <w:lang w:val="en-IN" w:eastAsia="en-IN" w:bidi="ml-IN"/>
+              </w:rPr>
+              <w:t xml:space="preserve"> </w:t>
+            </w:r>
+            <w:r>
+              <w:rPr>
+                <w:rFonts w:ascii="BRH Malayalam Extra" w:eastAsia="Times New Roman" w:hAnsi="BRH Malayalam Extra" w:cs="BRH Malayalam Extra"/>
+                <w:color w:val="EE0000"/>
+                <w:sz w:val="40"/>
+                <w:szCs w:val="40"/>
+                <w:lang w:val="en-IN" w:eastAsia="en-IN" w:bidi="ml-IN"/>
+              </w:rPr>
+              <w:t>- Zûxj— ||</w:t>
             </w:r>
           </w:p>
         </w:tc>
@@ -3962,6 +4496,7 @@
                 <w:sz w:val="32"/>
                 <w:szCs w:val="32"/>
               </w:rPr>
+              <w:lastRenderedPageBreak/>
               <w:t>Section, Paragraph</w:t>
             </w:r>
           </w:p>
@@ -4062,7 +4597,6 @@
                 <w:sz w:val="28"/>
                 <w:szCs w:val="32"/>
               </w:rPr>
-              <w:lastRenderedPageBreak/>
               <w:t>T.S.5.3.</w:t>
             </w:r>
             <w:r>
@@ -5994,7 +6528,18 @@
                 <w:szCs w:val="40"/>
                 <w:lang w:val="en-IN" w:eastAsia="en-IN" w:bidi="ml-IN"/>
               </w:rPr>
-              <w:t>±—sxI | d£</w:t>
+              <w:t xml:space="preserve">±—sxI | </w:t>
+            </w:r>
+            <w:r>
+              <w:rPr>
+                <w:rFonts w:ascii="BRH Malayalam Extra" w:eastAsia="Times New Roman" w:hAnsi="BRH Malayalam Extra" w:cs="BRH Malayalam Extra"/>
+                <w:color w:val="000000"/>
+                <w:sz w:val="40"/>
+                <w:szCs w:val="40"/>
+                <w:lang w:val="en-IN" w:eastAsia="en-IN" w:bidi="ml-IN"/>
+              </w:rPr>
+              <w:lastRenderedPageBreak/>
+              <w:t>d£</w:t>
             </w:r>
             <w:r>
               <w:rPr>
@@ -6075,6 +6620,7 @@
                 <w:szCs w:val="40"/>
                 <w:lang w:val="en-IN" w:eastAsia="en-IN" w:bidi="ml-IN"/>
               </w:rPr>
+              <w:lastRenderedPageBreak/>
               <w:t>jx</w:t>
             </w:r>
             <w:r>
@@ -6211,6 +6757,7 @@
                 <w:szCs w:val="40"/>
                 <w:lang w:val="en-IN" w:eastAsia="en-IN" w:bidi="ml-IN"/>
               </w:rPr>
+              <w:lastRenderedPageBreak/>
               <w:t>d£</w:t>
             </w:r>
             <w:r>
@@ -8155,6 +8702,7 @@
                 <w:sz w:val="28"/>
                 <w:szCs w:val="32"/>
               </w:rPr>
+              <w:lastRenderedPageBreak/>
               <w:t>T.S.5.3.10.3 – Kramam</w:t>
             </w:r>
           </w:p>
@@ -8610,7 +9158,6 @@
                 <w:sz w:val="28"/>
                 <w:szCs w:val="32"/>
               </w:rPr>
-              <w:lastRenderedPageBreak/>
               <w:t>T.S.5.3.11.3 – Kramam</w:t>
             </w:r>
           </w:p>
@@ -8859,7 +9406,16 @@
           <w:bCs/>
           <w:sz w:val="32"/>
         </w:rPr>
-        <w:t>replaced with</w:t>
+        <w:t xml:space="preserve">replaced </w:t>
+      </w:r>
+      <w:proofErr w:type="gramStart"/>
+      <w:r>
+        <w:rPr>
+          <w:b/>
+          <w:bCs/>
+          <w:sz w:val="32"/>
+        </w:rPr>
+        <w:t>with</w:t>
       </w:r>
       <w:r>
         <w:rPr>
@@ -8881,6 +9437,7 @@
         </w:rPr>
         <w:t>"</w:t>
       </w:r>
+      <w:proofErr w:type="gramEnd"/>
       <w:r>
         <w:rPr>
           <w:rFonts w:ascii="BRH Malayalam" w:hAnsi="BRH Malayalam" w:cs="BRH Malayalam"/>
@@ -8892,6 +9449,7 @@
         </w:rPr>
         <w:t>q§T</w:t>
       </w:r>
+      <w:proofErr w:type="gramStart"/>
       <w:r>
         <w:rPr>
           <w:rFonts w:ascii="BRH Malayalam" w:hAnsi="BRH Malayalam" w:cs="BRH Malayalam"/>
@@ -8908,7 +9466,16 @@
           <w:bCs/>
           <w:sz w:val="32"/>
         </w:rPr>
-        <w:t>wherever applicable</w:t>
+        <w:t>wherever</w:t>
+      </w:r>
+      <w:proofErr w:type="gramEnd"/>
+      <w:r>
+        <w:rPr>
+          <w:b/>
+          <w:bCs/>
+          <w:sz w:val="32"/>
+        </w:rPr>
+        <w:t xml:space="preserve"> applicable</w:t>
       </w:r>
     </w:p>
     <w:p>

</xml_diff>